<commit_message>
Add separate draft workflow for chapter review
</commit_message>
<xml_diff>
--- a/book/build/Lean-and-Agile.docx
+++ b/book/build/Lean-and-Agile.docx
@@ -10250,49 +10250,6 @@
     </w:p>
     <w:p/>
     <w:p>
-      <w:r>
-        <w:t xml:space="preserve">---
-</w:t>
-      </w:r>
-    </w:p>
-    <w:p>
-      <w:r>
-        <w:t xml:space="preserve">chapter: 13
-</w:t>
-      </w:r>
-    </w:p>
-    <w:p>
-      <w:r>
-        <w:t xml:space="preserve">slug: epilogue
-</w:t>
-      </w:r>
-    </w:p>
-    <w:p>
-      <w:r>
-        <w:t xml:space="preserve">title: Epilogue: The End of the Beginning
-</w:t>
-      </w:r>
-    </w:p>
-    <w:p>
-      <w:r>
-        <w:t xml:space="preserve">status: draft
-</w:t>
-      </w:r>
-    </w:p>
-    <w:p>
-      <w:r>
-        <w:t xml:space="preserve">source: Lean and Agile.docx
-</w:t>
-      </w:r>
-    </w:p>
-    <w:p>
-      <w:r>
-        <w:t xml:space="preserve">---
-</w:t>
-      </w:r>
-    </w:p>
-    <w:p/>
-    <w:p>
       <w:pPr>
         <w:pStyle w:val="Heading1"/>
       </w:pPr>
@@ -10300,504 +10257,10 @@
         <w:t xml:space="preserve">Epilogue: The End of the Beginning</w:t>
       </w:r>
     </w:p>
-    <w:p>
-      <w:r>
-        <w:t xml:space="preserve">We’ve covered a lot of ground—from Lean and Agile to Six Sigma, ITIL, and AI. But at the core of it all, this book has been about something much simpler: the pursuit of quality, the power of continuous improvement, and the role that leadership, culture, and process play in making that happen.
-</w:t>
-      </w:r>
-    </w:p>
-    <w:p/>
-    <w:p>
-      <w:r>
-        <w:t xml:space="preserve">More than anything, it’s been about people.
-</w:t>
-      </w:r>
-    </w:p>
-    <w:p/>
-    <w:p>
-      <w:r>
-        <w:t xml:space="preserve">People who want to do great work but are too often trapped in broken systems.
-</w:t>
-      </w:r>
-    </w:p>
-    <w:p>
-      <w:r>
-        <w:t xml:space="preserve">Leaders who want to drive improvement but are overwhelmed by complexity.
-</w:t>
-      </w:r>
-    </w:p>
-    <w:p>
-      <w:r>
-        <w:t xml:space="preserve">Organizations that aspire to deliver value but struggle to align efforts.
-</w:t>
-      </w:r>
-    </w:p>
-    <w:p/>
-    <w:p>
-      <w:r>
-        <w:t xml:space="preserve">W. Edwards Deming understood this better than anyone. He didn’t just teach quality management—he transformed the way businesses operate by proving that the most significant improvements don’t come from tools, software, or quick fixes. They come from a commitment to long-term change, from leaders who remove barriers, and from teams that take pride in their work.
-</w:t>
-      </w:r>
-    </w:p>
-    <w:p/>
-    <w:p>
-      <w:r>
-        <w:t xml:space="preserve">Deming’s 14 Points Revisited
-</w:t>
-      </w:r>
-    </w:p>
-    <w:p/>
-    <w:p>
-      <w:r>
-        <w:t xml:space="preserve">If you take nothing else from this book, take this: Deming’s 14 Points aren’t just historical artifacts. They are the roadmap for any organization that wants to survive and thrive. So let’s revisit them one last time—not as theory, but as action steps you can take today.
-</w:t>
-      </w:r>
-    </w:p>
-    <w:p/>
-    <w:p>
-      <w:r>
-        <w:t xml:space="preserve">1. Create Constancy of Purpose
-</w:t>
-      </w:r>
-    </w:p>
-    <w:p/>
-    <w:p>
-      <w:r>
-        <w:t xml:space="preserve">Improvement isn’t a one-time project; it’s a way of operating. Organizations must commit to long-term thinking rather than chasing quarterly numbers. What’s your long-term vision? Do your daily efforts align with it?
-</w:t>
-      </w:r>
-    </w:p>
-    <w:p/>
-    <w:p>
-      <w:r>
-        <w:t xml:space="preserve">🔹 Action: Identify a single long-term improvement initiative and commit to it, even when short-term pressures arise.
-</w:t>
-      </w:r>
-    </w:p>
-    <w:p/>
-    <w:p>
-      <w:r>
-        <w:t xml:space="preserve">2. Adopt the New Philosophy
-</w:t>
-      </w:r>
-    </w:p>
-    <w:p/>
-    <w:p>
-      <w:r>
-        <w:t xml:space="preserve">Old habits die hard, but survival requires adaptation. The world of work is evolving, and clinging to outdated processes isn’t just ineffective—it’s dangerous.
-</w:t>
-      </w:r>
-    </w:p>
-    <w:p/>
-    <w:p>
-      <w:r>
-        <w:t xml:space="preserve">🔹 Action: Identify one ineffective process or habit in your team that persists “because that’s how we’ve always done it.” Challenge it.
-</w:t>
-      </w:r>
-    </w:p>
-    <w:p/>
-    <w:p>
-      <w:r>
-        <w:t xml:space="preserve">3. Cease Dependence on Inspection to Achieve Quality
-</w:t>
-      </w:r>
-    </w:p>
-    <w:p/>
-    <w:p>
-      <w:r>
-        <w:t xml:space="preserve">Quality should be built into the process, not inspected at the end. If your workflow is a series of checks and corrections, you’re paying for mistakes that never should have happened.
-</w:t>
-      </w:r>
-    </w:p>
-    <w:p/>
-    <w:p>
-      <w:r>
-        <w:t xml:space="preserve">🔹 Action: Look at your team’s error rates. What could be changed upstream to prevent them rather than catching them later?
-</w:t>
-      </w:r>
-    </w:p>
-    <w:p/>
-    <w:p>
-      <w:r>
-        <w:t xml:space="preserve">4. End the Practice of Awarding Business on Price Alone
-</w:t>
-      </w:r>
-    </w:p>
-    <w:p/>
-    <w:p>
-      <w:r>
-        <w:t xml:space="preserve">Lowest cost often means lowest quality. True improvement comes from long-term relationships with suppliers and partners who are aligned on quality, not just price.
-</w:t>
-      </w:r>
-    </w:p>
-    <w:p/>
-    <w:p>
-      <w:r>
-        <w:t xml:space="preserve">🔹 Action: If you control purchasing decisions, evaluate suppliers based on their contribution to quality, not just cost.
-</w:t>
-      </w:r>
-    </w:p>
-    <w:p/>
-    <w:p>
-      <w:r>
-        <w:t xml:space="preserve">5. Improve Constantly and Forever
-</w:t>
-      </w:r>
-    </w:p>
-    <w:p/>
-    <w:p>
-      <w:r>
-        <w:t xml:space="preserve">Continuous improvement isn’t just a buzzword—it’s a culture. If you’re not getting better, you’re falling behind.
-</w:t>
-      </w:r>
-    </w:p>
-    <w:p/>
-    <w:p>
-      <w:r>
-        <w:t xml:space="preserve">🔹 Action: Encourage team members to suggest improvements and actually implement one this quarter.
-</w:t>
-      </w:r>
-    </w:p>
-    <w:p/>
-    <w:p>
-      <w:r>
-        <w:t xml:space="preserve">6. Institute Training on the Job
-</w:t>
-      </w:r>
-    </w:p>
-    <w:p/>
-    <w:p>
-      <w:r>
-        <w:t xml:space="preserve">Too often, employees are expected to “figure it out.” That’s not training; that’s setting them up to fail. Skilled employees create better outcomes.
-</w:t>
-      </w:r>
-    </w:p>
-    <w:p/>
-    <w:p>
-      <w:r>
-        <w:t xml:space="preserve">🔹 Action: Identify a skill gap in your team and invest in structured learning—whether through coaching, workshops, or cross-training.
-</w:t>
-      </w:r>
-    </w:p>
-    <w:p/>
-    <w:p>
-      <w:r>
-        <w:t xml:space="preserve">7. Adopt and Institute Leadership
-</w:t>
-      </w:r>
-    </w:p>
-    <w:p/>
-    <w:p>
-      <w:r>
-        <w:t xml:space="preserve">Management is about systems. Leadership is about people. Too many managers try to control work instead of enabling great work.
-</w:t>
-      </w:r>
-    </w:p>
-    <w:p/>
-    <w:p>
-      <w:r>
-        <w:t xml:space="preserve">🔹 Action: Instead of dictating solutions, ask your team: “What’s the biggest obstacle in your way, and how can I help remove it?”
-</w:t>
-      </w:r>
-    </w:p>
-    <w:p/>
-    <w:p>
-      <w:r>
-        <w:t xml:space="preserve">8. Drive Out Fear
-</w:t>
-      </w:r>
-    </w:p>
-    <w:p/>
-    <w:p>
-      <w:r>
-        <w:t xml:space="preserve">Fear keeps people from speaking up, from experimenting, from improving. Organizations that punish mistakes create cultures of silence.
-</w:t>
-      </w:r>
-    </w:p>
-    <w:p/>
-    <w:p>
-      <w:r>
-        <w:t xml:space="preserve">🔹 Action: Run a meeting where the focus is on discussing what went wrong—without blame—and how to improve.
-</w:t>
-      </w:r>
-    </w:p>
-    <w:p/>
-    <w:p>
-      <w:r>
-        <w:t xml:space="preserve">9. Break Down Barriers Between Departments
-</w:t>
-      </w:r>
-    </w:p>
-    <w:p/>
-    <w:p>
-      <w:r>
-        <w:t xml:space="preserve">Silos kill efficiency. The best organizations align their teams toward common goals rather than competing for resources and credit.
-</w:t>
-      </w:r>
-    </w:p>
-    <w:p/>
-    <w:p>
-      <w:r>
-        <w:t xml:space="preserve">🔹 Action: Schedule a conversation with a team outside your department to better understand how you can collaborate.
-</w:t>
-      </w:r>
-    </w:p>
-    <w:p/>
-    <w:p>
-      <w:r>
-        <w:t xml:space="preserve">10. Eliminate Slogans and Targets Without a Method
-</w:t>
-      </w:r>
-    </w:p>
-    <w:p/>
-    <w:p>
-      <w:r>
-        <w:t xml:space="preserve">“Work harder” isn’t a strategy. “Zero defects” isn’t a plan. Empty slogans demoralize employees who know that real change requires real action.
-</w:t>
-      </w:r>
-    </w:p>
-    <w:p/>
-    <w:p>
-      <w:r>
-        <w:t xml:space="preserve">🔹 Action: Replace a vague goal with a specific, measurable, and achievable improvement plan.
-</w:t>
-      </w:r>
-    </w:p>
-    <w:p/>
-    <w:p>
-      <w:r>
-        <w:t xml:space="preserve">11. Eliminate Work Standards That Focus Solely on Quotas
-</w:t>
-      </w:r>
-    </w:p>
-    <w:p/>
-    <w:p>
-      <w:r>
-        <w:t xml:space="preserve">If your organization measures success only in terms of numbers (call times, lines of code, tickets closed), you’re missing the bigger picture. Quality must be part of the equation.
-</w:t>
-      </w:r>
-    </w:p>
-    <w:p/>
-    <w:p>
-      <w:r>
-        <w:t xml:space="preserve">🔹 Action: Identify a performance metric that prioritizes quality over raw output.
-</w:t>
-      </w:r>
-    </w:p>
-    <w:p/>
-    <w:p>
-      <w:r>
-        <w:t xml:space="preserve">12. Remove Barriers to Pride in Workmanship
-</w:t>
-      </w:r>
-    </w:p>
-    <w:p/>
-    <w:p>
-      <w:r>
-        <w:t xml:space="preserve">People want to do great work—but often, systems, policies, and bureaucracy get in their way.
-</w:t>
-      </w:r>
-    </w:p>
-    <w:p/>
-    <w:p>
-      <w:r>
-        <w:t xml:space="preserve">🔹 Action: Ask your team: “What frustrates you the most about your work?” Then, work to eliminate it.
-</w:t>
-      </w:r>
-    </w:p>
-    <w:p/>
-    <w:p>
-      <w:r>
-        <w:t xml:space="preserve">13. Institute a Vigorous Program of Education and Self-Improvement
-</w:t>
-      </w:r>
-    </w:p>
-    <w:p/>
-    <w:p>
-      <w:r>
-        <w:t xml:space="preserve">Organizations that invest in learning outperform those that don’t. The best employees are always growing.
-</w:t>
-      </w:r>
-    </w:p>
-    <w:p/>
-    <w:p>
-      <w:r>
-        <w:t xml:space="preserve">🔹 Action: Set aside time for personal or team-wide skill development. If budgets are tight, use free online resources.
-</w:t>
-      </w:r>
-    </w:p>
-    <w:p/>
-    <w:p>
-      <w:r>
-        <w:t xml:space="preserve">14. Put Everyone to Work in the Transformation
-</w:t>
-      </w:r>
-    </w:p>
-    <w:p/>
-    <w:p>
-      <w:r>
-        <w:t xml:space="preserve">Improvement isn’t the responsibility of a single department—it’s everyone’s job.
-</w:t>
-      </w:r>
-    </w:p>
-    <w:p/>
-    <w:p>
-      <w:r>
-        <w:t xml:space="preserve">🔹 Action: Make continuous improvement a standing agenda item in team meetings, ensuring that everyone contributes ideas.
-</w:t>
-      </w:r>
-    </w:p>
-    <w:p/>
-    <w:p>
-      <w:r>
-        <w:t xml:space="preserve">The 7 Deadly Diseases of Management
-</w:t>
-      </w:r>
-    </w:p>
-    <w:p/>
-    <w:p>
-      <w:r>
-        <w:t xml:space="preserve">Deming didn’t just offer solutions—he warned against common pitfalls that destroy organizations. These include:
-</w:t>
-      </w:r>
-    </w:p>
-    <w:p/>
-    <w:p>
-      <w:r>
-        <w:t xml:space="preserve">Lack of constancy of purpose – Chasing short-term profits at the expense of long-term strategy.
-</w:t>
-      </w:r>
-    </w:p>
-    <w:p/>
-    <w:p>
-      <w:r>
-        <w:t xml:space="preserve">Emphasis on short-term profits – Prioritizing stock price over sustainable success.
-</w:t>
-      </w:r>
-    </w:p>
-    <w:p/>
-    <w:p>
-      <w:r>
-        <w:t xml:space="preserve">Annual performance reviews – Measuring individuals instead of improving systems.
-</w:t>
-      </w:r>
-    </w:p>
-    <w:p/>
-    <w:p>
-      <w:r>
-        <w:t xml:space="preserve">Job hopping by managers – Leadership without continuity.
-</w:t>
-      </w:r>
-    </w:p>
-    <w:p/>
-    <w:p>
-      <w:r>
-        <w:t xml:space="preserve">Running a company on visible figures alone – Ignoring the intangibles like culture, trust, and pride in work.
-</w:t>
-      </w:r>
-    </w:p>
-    <w:p/>
-    <w:p>
-      <w:r>
-        <w:t xml:space="preserve">Excessive medical costs – For organizations, this means treating symptoms instead of fixing root causes.
-</w:t>
-      </w:r>
-    </w:p>
-    <w:p/>
-    <w:p>
-      <w:r>
-        <w:t xml:space="preserve">Excessive costs of liability – A culture of blame instead of accountability.
-</w:t>
-      </w:r>
-    </w:p>
-    <w:p/>
-    <w:p>
-      <w:r>
-        <w:t xml:space="preserve">How many of these exist in your organization? And more importantly—what will you do about it?
-</w:t>
-      </w:r>
-    </w:p>
-    <w:p/>
-    <w:p>
-      <w:r>
-        <w:t xml:space="preserve">What Happens Next?
-</w:t>
-      </w:r>
-    </w:p>
-    <w:p/>
-    <w:p>
-      <w:r>
-        <w:t xml:space="preserve">The book may be ending, but the real work is just beginning.
-</w:t>
-      </w:r>
-    </w:p>
-    <w:p/>
-    <w:p>
-      <w:r>
-        <w:t xml:space="preserve">Improvement isn’t about reading a book and nodding along. It’s about taking action. Small changes, made consistently, transform organizations.
-</w:t>
-      </w:r>
-    </w:p>
-    <w:p/>
-    <w:p>
-      <w:r>
-        <w:t xml:space="preserve">So, let’s end where we started: with a simple challenge.
-</w:t>
-      </w:r>
-    </w:p>
-    <w:p/>
-    <w:p>
-      <w:r>
-        <w:t xml:space="preserve">Ask yourself—what’s one thing from this book that you can apply tomorrow?
-</w:t>
-      </w:r>
-    </w:p>
-    <w:p/>
-    <w:p>
-      <w:r>
-        <w:t xml:space="preserve">Just one.
-</w:t>
-      </w:r>
-    </w:p>
-    <w:p/>
-    <w:p>
-      <w:r>
-        <w:t xml:space="preserve">Then, next week, another.
-</w:t>
-      </w:r>
-    </w:p>
-    <w:p/>
-    <w:p>
-      <w:r>
-        <w:t xml:space="preserve">Then, a month from now, reflect. How has your work changed? How has your team responded?
-</w:t>
-      </w:r>
-    </w:p>
-    <w:p/>
-    <w:p>
-      <w:r>
-        <w:t xml:space="preserve">Quality isn’t a program. It’s a decision. A mindset. A habit.
-</w:t>
-      </w:r>
-    </w:p>
-    <w:p/>
-    <w:p>
-      <w:r>
-        <w:t xml:space="preserve">And it starts with you.
-</w:t>
-      </w:r>
-    </w:p>
-    <w:p/>
-    <w:p>
-      <w:r>
-        <w:t xml:space="preserve">The Future Is Yours to Build.
-</w:t>
-      </w:r>
-    </w:p>
-    <w:p/>
-    <w:p>
-      <w:r>
-        <w:t xml:space="preserve">Now go build it.</w:t>
+    <w:p/>
+    <w:p>
+      <w:r>
+        <w:t xml:space="preserve">Temporary verification paragraph.</w:t>
       </w:r>
     </w:p>
     <w:sectPr>

</xml_diff>